<commit_message>
5 - Replaced Gong with Tam-tam
</commit_message>
<xml_diff>
--- a/Front Matter/Template/Pieces/5_Front-Matter.docx
+++ b/Front Matter/Template/Pieces/5_Front-Matter.docx
@@ -4728,19 +4728,36 @@
       </w:r>
       <w:r>
         <w:rPr>
-          <w:rFonts w:ascii="Noto Serif SC" w:eastAsia="Noto Serif SC" w:hAnsi="Noto Serif SC" w:cs="Noto Serif"/>
-          <w:sz w:val="20"/>
-          <w:szCs w:val="20"/>
-        </w:rPr>
-        <w:t>锣 Gon</w:t>
-      </w:r>
-      <w:r>
-        <w:rPr>
-          <w:rFonts w:ascii="Noto Serif SC" w:eastAsia="Noto Serif SC" w:hAnsi="Noto Serif SC" w:cs="Noto Serif"/>
-          <w:sz w:val="20"/>
-          <w:szCs w:val="20"/>
-        </w:rPr>
-        <w:t xml:space="preserve">g, </w:t>
+          <w:rFonts w:ascii="Noto Serif SC" w:eastAsia="Noto Serif SC" w:hAnsi="Noto Serif SC" w:cs="Noto Serif" w:hint="eastAsia"/>
+          <w:sz w:val="20"/>
+          <w:szCs w:val="20"/>
+          <w:lang w:val="en-US"/>
+        </w:rPr>
+        <w:t>低音锣</w:t>
+      </w:r>
+      <w:r>
+        <w:rPr>
+          <w:rFonts w:ascii="Noto Serif SC" w:eastAsia="Noto Serif SC" w:hAnsi="Noto Serif SC" w:cs="Noto Serif"/>
+          <w:sz w:val="20"/>
+          <w:szCs w:val="20"/>
+        </w:rPr>
+        <w:t xml:space="preserve"> </w:t>
+      </w:r>
+      <w:r>
+        <w:rPr>
+          <w:rFonts w:ascii="Noto Serif SC" w:eastAsia="Noto Serif SC" w:hAnsi="Noto Serif SC" w:cs="Noto Serif"/>
+          <w:sz w:val="20"/>
+          <w:szCs w:val="20"/>
+        </w:rPr>
+        <w:t>Tam-tam</w:t>
+      </w:r>
+      <w:r>
+        <w:rPr>
+          <w:rFonts w:ascii="Noto Serif SC" w:eastAsia="Noto Serif SC" w:hAnsi="Noto Serif SC" w:cs="Noto Serif"/>
+          <w:sz w:val="20"/>
+          <w:szCs w:val="20"/>
+        </w:rPr>
+        <w:t xml:space="preserve">, </w:t>
       </w:r>
       <w:r>
         <w:rPr>
@@ -5626,7 +5643,6 @@
   <w:style w:type="character" w:default="1" w:styleId="DefaultParagraphFont">
     <w:name w:val="Default Paragraph Font"/>
     <w:uiPriority w:val="1"/>
-    <w:semiHidden/>
     <w:unhideWhenUsed/>
   </w:style>
   <w:style w:type="table" w:default="1" w:styleId="TableNormal">

</xml_diff>